<commit_message>
(Component selection and documentation) bomV2 and hardware overview
</commit_message>
<xml_diff>
--- a/VitalLink_ECG_Breakout_R1/Documentation/ECG_DESIGN.docx
+++ b/VitalLink_ECG_Breakout_R1/Documentation/ECG_DESIGN.docx
@@ -2,7 +2,215 @@
 <file path=word/document.xml><?xml version="1.0" encoding="utf-8"?>
 <w:document xmlns:wpc="http://schemas.microsoft.com/office/word/2010/wordprocessingCanvas" xmlns:cx="http://schemas.microsoft.com/office/drawing/2014/chartex" xmlns:cx1="http://schemas.microsoft.com/office/drawing/2015/9/8/chartex" xmlns:cx2="http://schemas.microsoft.com/office/drawing/2015/10/21/chartex" xmlns:cx3="http://schemas.microsoft.com/office/drawing/2016/5/9/chartex" xmlns:cx4="http://schemas.microsoft.com/office/drawing/2016/5/10/chartex" xmlns:cx5="http://schemas.microsoft.com/office/drawing/2016/5/11/chartex" xmlns:cx6="http://schemas.microsoft.com/office/drawing/2016/5/12/chartex" xmlns:cx7="http://schemas.microsoft.com/office/drawing/2016/5/13/chartex" xmlns:cx8="http://schemas.microsoft.com/office/drawing/2016/5/14/chartex" xmlns:mc="http://schemas.openxmlformats.org/markup-compatibility/2006" xmlns:aink="http://schemas.microsoft.com/office/drawing/2016/ink" xmlns:am3d="http://schemas.microsoft.com/office/drawing/2017/model3d" xmlns:o="urn:schemas-microsoft-com:office:office" xmlns:oel="http://schemas.microsoft.com/office/2019/extlst" xmlns:r="http://schemas.openxmlformats.org/officeDocument/2006/relationships" xmlns:m="http://schemas.openxmlformats.org/officeDocument/2006/math" xmlns:v="urn:schemas-microsoft-com:vml" xmlns:wp14="http://schemas.microsoft.com/office/word/2010/wordprocessingDrawing" xmlns:wp="http://schemas.openxmlformats.org/drawingml/2006/wordprocessingDrawing" xmlns:w10="urn:schemas-microsoft-com:office:word" xmlns:w="http://schemas.openxmlformats.org/wordprocessingml/2006/main" xmlns:w14="http://schemas.microsoft.com/office/word/2010/wordml" xmlns:w15="http://schemas.microsoft.com/office/word/2012/wordml" xmlns:w16cex="http://schemas.microsoft.com/office/word/2018/wordml/cex" xmlns:w16cid="http://schemas.microsoft.com/office/word/2016/wordml/cid" xmlns:w16="http://schemas.microsoft.com/office/word/2018/wordml" xmlns:w16du="http://schemas.microsoft.com/office/word/2023/wordml/word16du" xmlns:w16sdtdh="http://schemas.microsoft.com/office/word/2020/wordml/sdtdatahash" xmlns:w16sdtfl="http://schemas.microsoft.com/office/word/2024/wordml/sdtformatlock" xmlns:w16se="http://schemas.microsoft.com/office/word/2015/wordml/symex" xmlns:wpg="http://schemas.microsoft.com/office/word/2010/wordprocessingGroup" xmlns:wpi="http://schemas.microsoft.com/office/word/2010/wordprocessingInk" xmlns:wne="http://schemas.microsoft.com/office/word/2006/wordml" xmlns:wps="http://schemas.microsoft.com/office/word/2010/wordprocessingShape" mc:Ignorable="w14 w15 w16se w16cid w16 w16cex w16sdtdh w16sdtfl w16du wp14">
   <w:body>
+    <w:p>
+      <w:pPr>
+        <w:pStyle w:val="Heading2"/>
+      </w:pPr>
+      <w:r>
+        <w:t>Why did I choose wet electrodes for ECG?</w:t>
+      </w:r>
+    </w:p>
+    <w:p>
+      <w:pPr>
+        <w:pStyle w:val="ListParagraph"/>
+        <w:numPr>
+          <w:ilvl w:val="0"/>
+          <w:numId w:val="1"/>
+        </w:numPr>
+        <w:rPr>
+          <w:b/>
+          <w:bCs/>
+        </w:rPr>
+      </w:pPr>
+      <w:r>
+        <w:t>Wet electrodes stick onto the body making node look nicer.</w:t>
+      </w:r>
+    </w:p>
+    <w:p>
+      <w:pPr>
+        <w:pStyle w:val="ListParagraph"/>
+        <w:numPr>
+          <w:ilvl w:val="0"/>
+          <w:numId w:val="1"/>
+        </w:numPr>
+        <w:rPr>
+          <w:b/>
+          <w:bCs/>
+        </w:rPr>
+      </w:pPr>
+      <w:r>
+        <w:t>On demo day, nobody wants to stick something on their heart that has touched 100 people’s hearts. So, it would just be a visual demo</w:t>
+      </w:r>
+    </w:p>
+    <w:p>
+      <w:pPr>
+        <w:pStyle w:val="ListParagraph"/>
+        <w:numPr>
+          <w:ilvl w:val="0"/>
+          <w:numId w:val="1"/>
+        </w:numPr>
+        <w:rPr>
+          <w:b/>
+          <w:bCs/>
+        </w:rPr>
+      </w:pPr>
+      <w:r>
+        <w:t xml:space="preserve"> Cleaner signal, reducing concern about extraction of respiration rate.</w:t>
+      </w:r>
+    </w:p>
+    <w:p>
+      <w:pPr>
+        <w:ind w:left="360"/>
+      </w:pPr>
+    </w:p>
+    <w:p>
+      <w:pPr>
+        <w:ind w:left="360"/>
+      </w:pPr>
+      <w:r>
+        <w:t>Something like this would be nice</w:t>
+      </w:r>
+    </w:p>
+    <w:p>
+      <w:pPr>
+        <w:ind w:left="360"/>
+      </w:pPr>
+      <w:r>
+        <w:rPr>
+          <w:noProof/>
+        </w:rPr>
+        <w:drawing>
+          <wp:inline distT="0" distB="0" distL="0" distR="0" wp14:anchorId="3F2FC772" wp14:editId="270327D3">
+            <wp:extent cx="2029108" cy="1257475"/>
+            <wp:effectExtent l="0" t="0" r="9525" b="0"/>
+            <wp:docPr id="933391869" name="Picture 1"/>
+            <wp:cNvGraphicFramePr>
+              <a:graphicFrameLocks xmlns:a="http://schemas.openxmlformats.org/drawingml/2006/main" noChangeAspect="1"/>
+            </wp:cNvGraphicFramePr>
+            <a:graphic xmlns:a="http://schemas.openxmlformats.org/drawingml/2006/main">
+              <a:graphicData uri="http://schemas.openxmlformats.org/drawingml/2006/picture">
+                <pic:pic xmlns:pic="http://schemas.openxmlformats.org/drawingml/2006/picture">
+                  <pic:nvPicPr>
+                    <pic:cNvPr id="933391869" name=""/>
+                    <pic:cNvPicPr/>
+                  </pic:nvPicPr>
+                  <pic:blipFill>
+                    <a:blip r:embed="rId5"/>
+                    <a:stretch>
+                      <a:fillRect/>
+                    </a:stretch>
+                  </pic:blipFill>
+                  <pic:spPr>
+                    <a:xfrm>
+                      <a:off x="0" y="0"/>
+                      <a:ext cx="2029108" cy="1257475"/>
+                    </a:xfrm>
+                    <a:prstGeom prst="rect">
+                      <a:avLst/>
+                    </a:prstGeom>
+                  </pic:spPr>
+                </pic:pic>
+              </a:graphicData>
+            </a:graphic>
+          </wp:inline>
+        </w:drawing>
+      </w:r>
+      <w:r>
+        <w:sym w:font="Wingdings" w:char="F0DF"/>
+      </w:r>
+      <w:r>
+        <w:t xml:space="preserve"> this is the goal for ECG. WET ELECTRODES. IDC</w:t>
+      </w:r>
+    </w:p>
+    <w:p>
+      <w:r>
+        <w:rPr>
+          <w:noProof/>
+        </w:rPr>
+        <w:drawing>
+          <wp:inline distT="0" distB="0" distL="0" distR="0" wp14:anchorId="3961CB8E" wp14:editId="078D963E">
+            <wp:extent cx="2237724" cy="1705308"/>
+            <wp:effectExtent l="0" t="0" r="0" b="0"/>
+            <wp:docPr id="365595641" name="Picture 1"/>
+            <wp:cNvGraphicFramePr>
+              <a:graphicFrameLocks xmlns:a="http://schemas.openxmlformats.org/drawingml/2006/main" noChangeAspect="1"/>
+            </wp:cNvGraphicFramePr>
+            <a:graphic xmlns:a="http://schemas.openxmlformats.org/drawingml/2006/main">
+              <a:graphicData uri="http://schemas.openxmlformats.org/drawingml/2006/picture">
+                <pic:pic xmlns:pic="http://schemas.openxmlformats.org/drawingml/2006/picture">
+                  <pic:nvPicPr>
+                    <pic:cNvPr id="365595641" name=""/>
+                    <pic:cNvPicPr/>
+                  </pic:nvPicPr>
+                  <pic:blipFill>
+                    <a:blip r:embed="rId6"/>
+                    <a:stretch>
+                      <a:fillRect/>
+                    </a:stretch>
+                  </pic:blipFill>
+                  <pic:spPr>
+                    <a:xfrm>
+                      <a:off x="0" y="0"/>
+                      <a:ext cx="2241456" cy="1708152"/>
+                    </a:xfrm>
+                    <a:prstGeom prst="rect">
+                      <a:avLst/>
+                    </a:prstGeom>
+                  </pic:spPr>
+                </pic:pic>
+              </a:graphicData>
+            </a:graphic>
+          </wp:inline>
+        </w:drawing>
+      </w:r>
+    </w:p>
+    <w:p>
+      <w:pPr>
+        <w:pStyle w:val="Heading2"/>
+      </w:pPr>
+      <w:r>
+        <w:t>Decision:</w:t>
+      </w:r>
+    </w:p>
+    <w:p>
+      <w:r>
+        <w:t>May be a good idea to talk with Anthony about the ECG/EMG design. Where must the placement of the electrodes be. How far apart must they be.</w:t>
+      </w:r>
+    </w:p>
     <w:p/>
+    <w:p>
+      <w:pPr>
+        <w:pStyle w:val="Heading1"/>
+      </w:pPr>
+      <w:r>
+        <w:t>Component selection options</w:t>
+      </w:r>
+    </w:p>
+    <w:p>
+      <w:r>
+        <w:t>MAX30003</w:t>
+      </w:r>
+      <w:r>
+        <w:t xml:space="preserve"> – PROVIDES only Heartrate. Simpler but less parameters</w:t>
+      </w:r>
+    </w:p>
+    <w:p>
+      <w:r>
+        <w:t>MAX30001 – provides heart-rate, bio-impedance, and respiration.</w:t>
+      </w:r>
+    </w:p>
+    <w:p/>
+    <w:p>
+      <w:r>
+        <w:lastRenderedPageBreak/>
+        <w:t xml:space="preserve">MAX30001 is picked because I’m interested in respiration. It is riskier, but I have a big interest in determining breathe-rate. </w:t>
+      </w:r>
+    </w:p>
+    <w:p>
+      <w:r>
+        <w:t>MAX30003 can be ordered simultaneously</w:t>
+      </w:r>
+    </w:p>
     <w:sectPr>
       <w:pgSz w:w="12240" w:h="15840"/>
       <w:pgMar w:top="1440" w:right="1440" w:bottom="1440" w:left="1440" w:header="708" w:footer="708" w:gutter="0"/>
@@ -11,6 +219,104 @@
     </w:sectPr>
   </w:body>
 </w:document>
+</file>
+
+<file path=word/numbering.xml><?xml version="1.0" encoding="utf-8"?>
+<w:numbering xmlns:wpc="http://schemas.microsoft.com/office/word/2010/wordprocessingCanvas" xmlns:cx="http://schemas.microsoft.com/office/drawing/2014/chartex" xmlns:cx1="http://schemas.microsoft.com/office/drawing/2015/9/8/chartex" xmlns:cx2="http://schemas.microsoft.com/office/drawing/2015/10/21/chartex" xmlns:cx3="http://schemas.microsoft.com/office/drawing/2016/5/9/chartex" xmlns:cx4="http://schemas.microsoft.com/office/drawing/2016/5/10/chartex" xmlns:cx5="http://schemas.microsoft.com/office/drawing/2016/5/11/chartex" xmlns:cx6="http://schemas.microsoft.com/office/drawing/2016/5/12/chartex" xmlns:cx7="http://schemas.microsoft.com/office/drawing/2016/5/13/chartex" xmlns:cx8="http://schemas.microsoft.com/office/drawing/2016/5/14/chartex" xmlns:mc="http://schemas.openxmlformats.org/markup-compatibility/2006" xmlns:aink="http://schemas.microsoft.com/office/drawing/2016/ink" xmlns:am3d="http://schemas.microsoft.com/office/drawing/2017/model3d" xmlns:o="urn:schemas-microsoft-com:office:office" xmlns:oel="http://schemas.microsoft.com/office/2019/extlst" xmlns:r="http://schemas.openxmlformats.org/officeDocument/2006/relationships" xmlns:m="http://schemas.openxmlformats.org/officeDocument/2006/math" xmlns:v="urn:schemas-microsoft-com:vml" xmlns:wp14="http://schemas.microsoft.com/office/word/2010/wordprocessingDrawing" xmlns:wp="http://schemas.openxmlformats.org/drawingml/2006/wordprocessingDrawing" xmlns:w10="urn:schemas-microsoft-com:office:word" xmlns:w="http://schemas.openxmlformats.org/wordprocessingml/2006/main" xmlns:w14="http://schemas.microsoft.com/office/word/2010/wordml" xmlns:w15="http://schemas.microsoft.com/office/word/2012/wordml" xmlns:w16cex="http://schemas.microsoft.com/office/word/2018/wordml/cex" xmlns:w16cid="http://schemas.microsoft.com/office/word/2016/wordml/cid" xmlns:w16="http://schemas.microsoft.com/office/word/2018/wordml" xmlns:w16du="http://schemas.microsoft.com/office/word/2023/wordml/word16du" xmlns:w16sdtdh="http://schemas.microsoft.com/office/word/2020/wordml/sdtdatahash" xmlns:w16sdtfl="http://schemas.microsoft.com/office/word/2024/wordml/sdtformatlock" xmlns:w16se="http://schemas.microsoft.com/office/word/2015/wordml/symex" xmlns:wpg="http://schemas.microsoft.com/office/word/2010/wordprocessingGroup" xmlns:wpi="http://schemas.microsoft.com/office/word/2010/wordprocessingInk" xmlns:wne="http://schemas.microsoft.com/office/word/2006/wordml" xmlns:wps="http://schemas.microsoft.com/office/word/2010/wordprocessingShape" mc:Ignorable="w14 w15 w16se w16cid w16 w16cex w16sdtdh w16sdtfl w16du wp14">
+  <w:abstractNum w:abstractNumId="0" w15:restartNumberingAfterBreak="0">
+    <w:nsid w:val="1E916427"/>
+    <w:multiLevelType w:val="hybridMultilevel"/>
+    <w:tmpl w:val="24BA3DE8"/>
+    <w:lvl w:ilvl="0" w:tplc="1009000F">
+      <w:start w:val="1"/>
+      <w:numFmt w:val="decimal"/>
+      <w:lvlText w:val="%1."/>
+      <w:lvlJc w:val="left"/>
+      <w:pPr>
+        <w:ind w:left="720" w:hanging="360"/>
+      </w:pPr>
+      <w:rPr>
+        <w:rFonts w:hint="default"/>
+        <w:b w:val="0"/>
+      </w:rPr>
+    </w:lvl>
+    <w:lvl w:ilvl="1" w:tplc="10090019" w:tentative="1">
+      <w:start w:val="1"/>
+      <w:numFmt w:val="lowerLetter"/>
+      <w:lvlText w:val="%2."/>
+      <w:lvlJc w:val="left"/>
+      <w:pPr>
+        <w:ind w:left="1440" w:hanging="360"/>
+      </w:pPr>
+    </w:lvl>
+    <w:lvl w:ilvl="2" w:tplc="1009001B" w:tentative="1">
+      <w:start w:val="1"/>
+      <w:numFmt w:val="lowerRoman"/>
+      <w:lvlText w:val="%3."/>
+      <w:lvlJc w:val="right"/>
+      <w:pPr>
+        <w:ind w:left="2160" w:hanging="180"/>
+      </w:pPr>
+    </w:lvl>
+    <w:lvl w:ilvl="3" w:tplc="1009000F" w:tentative="1">
+      <w:start w:val="1"/>
+      <w:numFmt w:val="decimal"/>
+      <w:lvlText w:val="%4."/>
+      <w:lvlJc w:val="left"/>
+      <w:pPr>
+        <w:ind w:left="2880" w:hanging="360"/>
+      </w:pPr>
+    </w:lvl>
+    <w:lvl w:ilvl="4" w:tplc="10090019" w:tentative="1">
+      <w:start w:val="1"/>
+      <w:numFmt w:val="lowerLetter"/>
+      <w:lvlText w:val="%5."/>
+      <w:lvlJc w:val="left"/>
+      <w:pPr>
+        <w:ind w:left="3600" w:hanging="360"/>
+      </w:pPr>
+    </w:lvl>
+    <w:lvl w:ilvl="5" w:tplc="1009001B" w:tentative="1">
+      <w:start w:val="1"/>
+      <w:numFmt w:val="lowerRoman"/>
+      <w:lvlText w:val="%6."/>
+      <w:lvlJc w:val="right"/>
+      <w:pPr>
+        <w:ind w:left="4320" w:hanging="180"/>
+      </w:pPr>
+    </w:lvl>
+    <w:lvl w:ilvl="6" w:tplc="1009000F" w:tentative="1">
+      <w:start w:val="1"/>
+      <w:numFmt w:val="decimal"/>
+      <w:lvlText w:val="%7."/>
+      <w:lvlJc w:val="left"/>
+      <w:pPr>
+        <w:ind w:left="5040" w:hanging="360"/>
+      </w:pPr>
+    </w:lvl>
+    <w:lvl w:ilvl="7" w:tplc="10090019" w:tentative="1">
+      <w:start w:val="1"/>
+      <w:numFmt w:val="lowerLetter"/>
+      <w:lvlText w:val="%8."/>
+      <w:lvlJc w:val="left"/>
+      <w:pPr>
+        <w:ind w:left="5760" w:hanging="360"/>
+      </w:pPr>
+    </w:lvl>
+    <w:lvl w:ilvl="8" w:tplc="1009001B" w:tentative="1">
+      <w:start w:val="1"/>
+      <w:numFmt w:val="lowerRoman"/>
+      <w:lvlText w:val="%9."/>
+      <w:lvlJc w:val="right"/>
+      <w:pPr>
+        <w:ind w:left="6480" w:hanging="180"/>
+      </w:pPr>
+    </w:lvl>
+  </w:abstractNum>
+  <w:num w:numId="1" w16cid:durableId="503515022">
+    <w:abstractNumId w:val="0"/>
+  </w:num>
+</w:numbering>
 </file>
 
 <file path=word/styles.xml><?xml version="1.0" encoding="utf-8"?>
@@ -441,7 +747,6 @@
     <w:next w:val="Normal"/>
     <w:link w:val="Heading2Char"/>
     <w:uiPriority w:val="9"/>
-    <w:semiHidden/>
     <w:unhideWhenUsed/>
     <w:qFormat/>
     <w:rsid w:val="000737F4"/>
@@ -616,7 +921,6 @@
   <w:style w:type="character" w:default="1" w:styleId="DefaultParagraphFont">
     <w:name w:val="Default Paragraph Font"/>
     <w:uiPriority w:val="1"/>
-    <w:semiHidden/>
     <w:unhideWhenUsed/>
   </w:style>
   <w:style w:type="table" w:default="1" w:styleId="TableNormal">
@@ -658,7 +962,6 @@
     <w:basedOn w:val="DefaultParagraphFont"/>
     <w:link w:val="Heading2"/>
     <w:uiPriority w:val="9"/>
-    <w:semiHidden/>
     <w:rsid w:val="000737F4"/>
     <w:rPr>
       <w:rFonts w:asciiTheme="majorHAnsi" w:eastAsiaTheme="majorEastAsia" w:hAnsiTheme="majorHAnsi" w:cstheme="majorBidi"/>

</xml_diff>